<commit_message>
Condense les CV FR et EN sur une seule page
Nouvelle mise en page compacte (navy/or) reprenant l'intégralité du
contenu clé : profil, compétences, 3 expériences, projets, formation,
langues. L'original 2 pages est conservé en dehors du dossier déployé
(Portfolio_Daryne_Voufo_backups/) au cas où.
</commit_message>
<xml_diff>
--- a/CV_Daryne_Voufo_EN.docx
+++ b/CV_Daryne_Voufo_EN.docx
@@ -4,7 +4,7 @@
   <w:body>
     <w:p>
       <w:pPr>
-        <w:spacing w:after="40"/>
+        <w:spacing w:after="20" w:before="0"/>
         <w:jc w:val="center"/>
       </w:pPr>
       <w:r>
@@ -12,741 +12,425 @@
           <w:rFonts w:ascii="Calibri" w:hAnsi="Calibri"/>
           <w:b/>
           <w:color w:val="12283F"/>
-          <w:sz w:val="40"/>
+          <w:sz w:val="38"/>
         </w:rPr>
         <w:t>DARYNE VOUFO</w:t>
       </w:r>
     </w:p>
     <w:p>
       <w:pPr>
-        <w:spacing w:after="120"/>
+        <w:spacing w:after="20" w:before="0"/>
         <w:jc w:val="center"/>
       </w:pPr>
       <w:r>
         <w:rPr>
           <w:rFonts w:ascii="Calibri" w:hAnsi="Calibri"/>
+          <w:b w:val="0"/>
           <w:color w:val="A9793F"/>
-          <w:sz w:val="25"/>
+          <w:sz w:val="22"/>
         </w:rPr>
         <w:t>Web Marketing Officer</w:t>
       </w:r>
     </w:p>
     <w:p>
       <w:pPr>
-        <w:spacing w:after="160"/>
+        <w:spacing w:after="80" w:before="0"/>
         <w:jc w:val="center"/>
       </w:pPr>
       <w:r>
         <w:rPr>
           <w:rFonts w:ascii="Calibri" w:hAnsi="Calibri"/>
+          <w:b w:val="0"/>
           <w:color w:val="5B6472"/>
-          <w:sz w:val="19"/>
+          <w:sz w:val="17"/>
         </w:rPr>
-        <w:t>voufodaryne072@gmail.com  ·  +33 (0)7 53 15 76 27  ·  linkedin.com/in/daryne-voufo-133938203  ·  Paris / Île-de-France, France</w:t>
+        <w:t>voufodaryne072@gmail.com · +33 (0)7 53 15 76 27 · linkedin.com/in/daryne-voufo-133938203 · Paris / Île-de-France, France</w:t>
       </w:r>
     </w:p>
     <w:p>
       <w:pPr>
-        <w:spacing w:before="200" w:after="80"/>
+        <w:spacing w:before="140" w:after="60"/>
+        <w:pBdr>
+          <w:bottom w:val="single" w:sz="5" w:space="2" w:color="12283F"/>
+        </w:pBdr>
       </w:pPr>
       <w:r>
         <w:rPr>
           <w:rFonts w:ascii="Calibri" w:hAnsi="Calibri"/>
           <w:b/>
           <w:color w:val="A9793F"/>
-          <w:sz w:val="23"/>
+          <w:sz w:val="21"/>
         </w:rPr>
         <w:t>PROFILE</w:t>
       </w:r>
     </w:p>
     <w:p>
       <w:pPr>
-        <w:spacing w:before="40" w:after="120"/>
-        <w:pBdr>
-          <w:bottom w:val="single" w:sz="6" w:space="1" w:color="12283F"/>
-        </w:pBdr>
-      </w:pPr>
-    </w:p>
-    <w:p>
-      <w:pPr>
-        <w:spacing w:after="120"/>
+        <w:spacing w:after="60" w:before="0"/>
+        <w:jc w:val="left"/>
       </w:pPr>
       <w:r>
         <w:rPr>
           <w:rFonts w:ascii="Calibri" w:hAnsi="Calibri"/>
           <w:b w:val="0"/>
-          <w:i w:val="0"/>
           <w:color w:val="1D2530"/>
-          <w:sz w:val="20"/>
+          <w:sz w:val="18"/>
         </w:rPr>
-        <w:t>Graduate of EM Strasbourg's Master's in Customer Journey Digitalisation, I combine hands-on B2B digital marketing expertise with a data-driven approach. Having completed a work-study programme at Lemonway (fintech) and an internship at CFPE France Parrainages, I master the full funnel: acquisition (Google Ads, LinkedIn Ads, SEO), CRM &amp; automation (Salesforce, Pardot), bilingual FR/EN content marketing and analytics reporting (GA4, Power BI). Available immediately for a permanent position in France.</w:t>
+        <w:t>Graduate of the EM Strasbourg Master's in Customer Journey Digitalisation, I combine hands-on B2B digital marketing expertise with a data-driven approach. Full-funnel ownership: acquisition, CRM &amp; automation, bilingual FR/EN content, analytics reporting. Available for a first role from 2026.</w:t>
       </w:r>
     </w:p>
     <w:p>
       <w:pPr>
-        <w:spacing w:before="200" w:after="80"/>
+        <w:spacing w:before="140" w:after="60"/>
+        <w:pBdr>
+          <w:bottom w:val="single" w:sz="5" w:space="2" w:color="12283F"/>
+        </w:pBdr>
       </w:pPr>
       <w:r>
         <w:rPr>
           <w:rFonts w:ascii="Calibri" w:hAnsi="Calibri"/>
           <w:b/>
           <w:color w:val="A9793F"/>
-          <w:sz w:val="23"/>
+          <w:sz w:val="21"/>
         </w:rPr>
         <w:t>KEY SKILLS</w:t>
       </w:r>
     </w:p>
     <w:p>
       <w:pPr>
-        <w:spacing w:before="40" w:after="120"/>
-        <w:pBdr>
-          <w:bottom w:val="single" w:sz="6" w:space="1" w:color="12283F"/>
-        </w:pBdr>
-      </w:pPr>
-    </w:p>
-    <w:p>
-      <w:pPr>
-        <w:spacing w:after="40"/>
+        <w:spacing w:after="30" w:before="0"/>
+        <w:jc w:val="left"/>
       </w:pPr>
       <w:r>
         <w:rPr>
           <w:rFonts w:ascii="Calibri" w:hAnsi="Calibri"/>
           <w:b w:val="0"/>
-          <w:i w:val="0"/>
           <w:color w:val="1D2530"/>
-          <w:sz w:val="20"/>
+          <w:sz w:val="18"/>
         </w:rPr>
         <w:t>Acquisition &amp; Paid: Google Ads, LinkedIn Ads, SEO/SEA, Lead Generation, A/B Testing</w:t>
       </w:r>
     </w:p>
     <w:p>
       <w:pPr>
-        <w:spacing w:after="40"/>
+        <w:spacing w:after="30" w:before="0"/>
+        <w:jc w:val="left"/>
       </w:pPr>
       <w:r>
         <w:rPr>
           <w:rFonts w:ascii="Calibri" w:hAnsi="Calibri"/>
           <w:b w:val="0"/>
-          <w:i w:val="0"/>
           <w:color w:val="1D2530"/>
-          <w:sz w:val="20"/>
+          <w:sz w:val="18"/>
         </w:rPr>
-        <w:t>CRM &amp; Automation: Salesforce, Pardot, HubSpot, Mailchimp, Webmecanik, Lead Nurturing, GDPR</w:t>
+        <w:t>CRM &amp; Automation: Salesforce, Pardot, HubSpot, Mailchimp, Lead Nurturing, GDPR</w:t>
       </w:r>
     </w:p>
     <w:p>
       <w:pPr>
-        <w:spacing w:after="40"/>
+        <w:spacing w:after="30" w:before="0"/>
+        <w:jc w:val="left"/>
       </w:pPr>
       <w:r>
         <w:rPr>
           <w:rFonts w:ascii="Calibri" w:hAnsi="Calibri"/>
           <w:b w:val="0"/>
-          <w:i w:val="0"/>
           <w:color w:val="1D2530"/>
-          <w:sz w:val="20"/>
+          <w:sz w:val="18"/>
         </w:rPr>
-        <w:t>Content &amp; Social: B2B Content Marketing, Copywriting FR/EN, WordPress, Strapi, Canva</w:t>
+        <w:t>Data &amp; Reporting: GA4, Power BI, Looker Studio, Python/Pandas, SQL, Excel VBA</w:t>
       </w:r>
     </w:p>
     <w:p>
       <w:pPr>
-        <w:spacing w:after="40"/>
+        <w:spacing w:after="30" w:before="0"/>
+        <w:jc w:val="left"/>
       </w:pPr>
       <w:r>
         <w:rPr>
           <w:rFonts w:ascii="Calibri" w:hAnsi="Calibri"/>
           <w:b w:val="0"/>
-          <w:i w:val="0"/>
           <w:color w:val="1D2530"/>
-          <w:sz w:val="20"/>
+          <w:sz w:val="18"/>
         </w:rPr>
-        <w:t>Data &amp; Reporting: GA4, Looker Studio, Power BI, Python (Pandas), SQL, Excel VBA — KPI tracking, conversion, CPL, ROI, MQL/SQL</w:t>
+        <w:t>Content &amp; SEO: WordPress, Strapi, Canva, Copywriting FR/EN, SEMrush, Ahrefs, Screaming Frog, Haloscan</w:t>
       </w:r>
     </w:p>
     <w:p>
       <w:pPr>
-        <w:spacing w:after="120"/>
+        <w:spacing w:after="60" w:before="0"/>
+        <w:jc w:val="left"/>
       </w:pPr>
       <w:r>
         <w:rPr>
           <w:rFonts w:ascii="Calibri" w:hAnsi="Calibri"/>
           <w:b w:val="0"/>
-          <w:i w:val="0"/>
           <w:color w:val="1D2530"/>
-          <w:sz w:val="20"/>
+          <w:sz w:val="18"/>
         </w:rPr>
-        <w:t>SEO &amp; Tools: SEMrush, Ahrefs, Screaming Frog, Search Console, Jira, Notion, Google Workspace, Microsoft 365</w:t>
+        <w:t>Tools &amp; AI: Jira, Notion, Google Workspace, Microsoft 365 — Generative AI &amp; Agents (Claude, ChatGPT, ChatLLM)</w:t>
       </w:r>
     </w:p>
     <w:p>
       <w:pPr>
-        <w:spacing w:before="200" w:after="80"/>
+        <w:spacing w:before="140" w:after="60"/>
+        <w:pBdr>
+          <w:bottom w:val="single" w:sz="5" w:space="2" w:color="12283F"/>
+        </w:pBdr>
       </w:pPr>
       <w:r>
         <w:rPr>
           <w:rFonts w:ascii="Calibri" w:hAnsi="Calibri"/>
           <w:b/>
           <w:color w:val="A9793F"/>
-          <w:sz w:val="23"/>
+          <w:sz w:val="21"/>
         </w:rPr>
         <w:t>PROFESSIONAL EXPERIENCE</w:t>
       </w:r>
     </w:p>
     <w:p>
       <w:pPr>
-        <w:spacing w:before="40" w:after="120"/>
-        <w:pBdr>
-          <w:bottom w:val="single" w:sz="6" w:space="1" w:color="12283F"/>
-        </w:pBdr>
+        <w:spacing w:after="20" w:before="0"/>
+        <w:jc w:val="left"/>
       </w:pPr>
+      <w:r>
+        <w:rPr>
+          <w:rFonts w:ascii="Calibri" w:hAnsi="Calibri"/>
+          <w:b/>
+          <w:color w:val="1D2530"/>
+          <w:sz w:val="18"/>
+        </w:rPr>
+        <w:t>Digital Marketing Officer — Lemonway, Paris (09/2024–09/2025)</w:t>
+      </w:r>
     </w:p>
-    <w:tbl>
-      <w:tblPr>
-        <w:tblW w:type="auto" w:w="0"/>
-        <w:jc w:val="left"/>
-        <w:tblLayout w:type="autofit"/>
-        <w:tblLook w:firstColumn="1" w:firstRow="1" w:lastColumn="0" w:lastRow="0" w:noHBand="0" w:noVBand="1" w:val="04A0"/>
-      </w:tblPr>
-      <w:tblGrid>
-        <w:gridCol w:w="5213"/>
-        <w:gridCol w:w="5213"/>
-      </w:tblGrid>
-      <w:tr>
-        <w:tc>
-          <w:tcPr>
-            <w:tcW w:type="dxa" w:w="5213"/>
-          </w:tcPr>
-          <w:p>
-            <w:r>
-              <w:rPr>
-                <w:rFonts w:ascii="Calibri" w:hAnsi="Calibri"/>
-                <w:b/>
-                <w:color w:val="12283F"/>
-                <w:sz w:val="22"/>
-              </w:rPr>
-              <w:t>Digital Marketing Officer  |  Lemonway | Paris</w:t>
-            </w:r>
-          </w:p>
-        </w:tc>
-        <w:tc>
-          <w:tcPr>
-            <w:tcW w:type="dxa" w:w="5213"/>
-          </w:tcPr>
-          <w:p>
-            <w:pPr>
-              <w:jc w:val="right"/>
-            </w:pPr>
-            <w:r>
-              <w:rPr>
-                <w:rFonts w:ascii="Calibri" w:hAnsi="Calibri"/>
-                <w:b/>
-                <w:color w:val="A9793F"/>
-                <w:sz w:val="19"/>
-              </w:rPr>
-              <w:t>09/2024 – 09/2025</w:t>
-            </w:r>
-          </w:p>
-        </w:tc>
-      </w:tr>
-    </w:tbl>
     <w:p>
       <w:pPr>
         <w:pStyle w:val="ListBullet"/>
-        <w:spacing w:after="60"/>
+        <w:spacing w:after="24"/>
       </w:pPr>
       <w:r>
         <w:rPr>
           <w:rFonts w:ascii="Calibri" w:hAnsi="Calibri"/>
           <w:color w:val="1D2530"/>
-          <w:sz w:val="20"/>
+          <w:sz w:val="18"/>
         </w:rPr>
-        <w:t>Drove the bilingual FR/EN B2B content strategy: 10 blog articles, 10+ LinkedIn posts and 20+ web pieces targeting prospects</w:t>
+        <w:t>Ran 6 B2B campaigns (Google Ads, LinkedIn Ads, emailing) — 90 qualified leads/month on average</w:t>
       </w:r>
     </w:p>
     <w:p>
       <w:pPr>
         <w:pStyle w:val="ListBullet"/>
-        <w:spacing w:after="60"/>
+        <w:spacing w:after="24"/>
       </w:pPr>
       <w:r>
         <w:rPr>
           <w:rFonts w:ascii="Calibri" w:hAnsi="Calibri"/>
           <w:color w:val="1D2530"/>
-          <w:sz w:val="20"/>
+          <w:sz w:val="18"/>
         </w:rPr>
-        <w:t>Ran 6 B2B digital campaigns (Google Ads, LinkedIn Ads, emailing) — 90 qualified leads (MQL) generated per month on average</w:t>
+        <w:t>Automated 4 Pardot nurturing workflows — 40% efficiency gain, GDPR-compliant</w:t>
       </w:r>
     </w:p>
     <w:p>
       <w:pPr>
         <w:pStyle w:val="ListBullet"/>
-        <w:spacing w:after="60"/>
+        <w:spacing w:after="24"/>
       </w:pPr>
       <w:r>
         <w:rPr>
           <w:rFonts w:ascii="Calibri" w:hAnsi="Calibri"/>
           <w:color w:val="1D2530"/>
-          <w:sz w:val="20"/>
+          <w:sz w:val="18"/>
         </w:rPr>
-        <w:t>Automated 4 nurturing workflows in Pardot (HTML/CSS) — 40% gain over manual processing, GDPR-compliant</w:t>
+        <w:t>Qualified 8,000 Salesforce contacts — cut unusable leads by 30%</w:t>
+      </w:r>
+    </w:p>
+    <w:p>
+      <w:pPr>
+        <w:spacing w:after="20" w:before="80"/>
+        <w:jc w:val="left"/>
+      </w:pPr>
+      <w:r>
+        <w:rPr>
+          <w:rFonts w:ascii="Calibri" w:hAnsi="Calibri"/>
+          <w:b/>
+          <w:color w:val="1D2530"/>
+          <w:sz w:val="18"/>
+        </w:rPr>
+        <w:t>Digital Marketing Specialist — CFPE France Parrainages, Paris (08/2023–01/2024)</w:t>
       </w:r>
     </w:p>
     <w:p>
       <w:pPr>
         <w:pStyle w:val="ListBullet"/>
-        <w:spacing w:after="60"/>
+        <w:spacing w:after="24"/>
       </w:pPr>
       <w:r>
         <w:rPr>
           <w:rFonts w:ascii="Calibri" w:hAnsi="Calibri"/>
           <w:color w:val="1D2530"/>
-          <w:sz w:val="20"/>
+          <w:sz w:val="18"/>
         </w:rPr>
-        <w:t>Qualified 8,000 contacts in Salesforce CRM — cut unusable leads by 30% over 3 months</w:t>
+        <w:t>Managed 8 email campaigns (97% delivery rate) and optimised 5 acquisition journeys via GA4 (-18% bounce rate)</w:t>
       </w:r>
     </w:p>
     <w:p>
       <w:pPr>
         <w:pStyle w:val="ListBullet"/>
-        <w:spacing w:after="60"/>
+        <w:spacing w:after="24"/>
       </w:pPr>
       <w:r>
         <w:rPr>
           <w:rFonts w:ascii="Calibri" w:hAnsi="Calibri"/>
           <w:color w:val="1D2530"/>
-          <w:sz w:val="20"/>
+          <w:sz w:val="18"/>
         </w:rPr>
-        <w:t>Increased email open rate by 20% through A/B testing and behavioural lead scoring</w:t>
+        <w:t>Competitive analysis adopted into the Q1 2024 marketing plan</w:t>
+      </w:r>
+    </w:p>
+    <w:p>
+      <w:pPr>
+        <w:spacing w:after="20" w:before="80"/>
+        <w:jc w:val="left"/>
+      </w:pPr>
+      <w:r>
+        <w:rPr>
+          <w:rFonts w:ascii="Calibri" w:hAnsi="Calibri"/>
+          <w:b/>
+          <w:color w:val="1D2530"/>
+          <w:sz w:val="18"/>
+        </w:rPr>
+        <w:t>Product Manager Assistant — American Cola (Source du Pays), Douala (03/2022–08/2022)</w:t>
       </w:r>
     </w:p>
     <w:p>
       <w:pPr>
         <w:pStyle w:val="ListBullet"/>
-        <w:spacing w:after="60"/>
+        <w:spacing w:after="24"/>
       </w:pPr>
       <w:r>
         <w:rPr>
           <w:rFonts w:ascii="Calibri" w:hAnsi="Calibri"/>
           <w:color w:val="1D2530"/>
-          <w:sz w:val="20"/>
+          <w:sz w:val="18"/>
         </w:rPr>
-        <w:t>Coordinated external webinars and events (Pardot campaign, lead forms, CRM follow-up) and built 2 acquisition tracking dashboards (traffic, conversion, ROI)</w:t>
+        <w:t>Market study (120 consumers) and competitor monitoring (6 players) for a product launch</w:t>
       </w:r>
     </w:p>
     <w:p>
       <w:pPr>
-        <w:pStyle w:val="ListBullet"/>
-        <w:spacing w:after="60"/>
-      </w:pPr>
-      <w:r>
-        <w:rPr>
-          <w:rFonts w:ascii="Calibri" w:hAnsi="Calibri"/>
-          <w:color w:val="1D2530"/>
-          <w:sz w:val="20"/>
-        </w:rPr>
-        <w:t>Launched the prospect newsletter for the B2B/B2C marketplaces and the crowdfunding platform</w:t>
-      </w:r>
-    </w:p>
-    <w:p>
-      <w:pPr>
-        <w:spacing w:after="160"/>
-      </w:pPr>
-      <w:r>
-        <w:rPr>
-          <w:rFonts w:ascii="Calibri" w:hAnsi="Calibri"/>
-          <w:b w:val="0"/>
-          <w:i/>
-          <w:color w:val="5B6472"/>
-          <w:sz w:val="18"/>
-        </w:rPr>
-        <w:t>Stack: Google Ads, LinkedIn Ads, Salesforce CRM, Pardot, GA4, Looker Studio, Excel VBA, WordPress, Strapi, Jira</w:t>
-      </w:r>
-    </w:p>
-    <w:tbl>
-      <w:tblPr>
-        <w:tblW w:type="auto" w:w="0"/>
-        <w:jc w:val="left"/>
-        <w:tblLayout w:type="autofit"/>
-        <w:tblLook w:firstColumn="1" w:firstRow="1" w:lastColumn="0" w:lastRow="0" w:noHBand="0" w:noVBand="1" w:val="04A0"/>
-      </w:tblPr>
-      <w:tblGrid>
-        <w:gridCol w:w="5213"/>
-        <w:gridCol w:w="5213"/>
-      </w:tblGrid>
-      <w:tr>
-        <w:tc>
-          <w:tcPr>
-            <w:tcW w:type="dxa" w:w="5213"/>
-          </w:tcPr>
-          <w:p>
-            <w:r>
-              <w:rPr>
-                <w:rFonts w:ascii="Calibri" w:hAnsi="Calibri"/>
-                <w:b/>
-                <w:color w:val="12283F"/>
-                <w:sz w:val="22"/>
-              </w:rPr>
-              <w:t>Digital Marketing Specialist  |  CFPE France Parrainages | Paris</w:t>
-            </w:r>
-          </w:p>
-        </w:tc>
-        <w:tc>
-          <w:tcPr>
-            <w:tcW w:type="dxa" w:w="5213"/>
-          </w:tcPr>
-          <w:p>
-            <w:pPr>
-              <w:jc w:val="right"/>
-            </w:pPr>
-            <w:r>
-              <w:rPr>
-                <w:rFonts w:ascii="Calibri" w:hAnsi="Calibri"/>
-                <w:b/>
-                <w:color w:val="A9793F"/>
-                <w:sz w:val="19"/>
-              </w:rPr>
-              <w:t>08/2023 – 01/2024</w:t>
-            </w:r>
-          </w:p>
-        </w:tc>
-      </w:tr>
-    </w:tbl>
-    <w:p>
-      <w:pPr>
-        <w:pStyle w:val="ListBullet"/>
-        <w:spacing w:after="60"/>
-      </w:pPr>
-      <w:r>
-        <w:rPr>
-          <w:rFonts w:ascii="Calibri" w:hAnsi="Calibri"/>
-          <w:color w:val="1D2530"/>
-          <w:sz w:val="20"/>
-        </w:rPr>
-        <w:t>Managed 8 half-yearly email campaigns (CRM segmentation, copywriting) — delivery rate maintained at 97%</w:t>
-      </w:r>
-    </w:p>
-    <w:p>
-      <w:pPr>
-        <w:pStyle w:val="ListBullet"/>
-        <w:spacing w:after="60"/>
-      </w:pPr>
-      <w:r>
-        <w:rPr>
-          <w:rFonts w:ascii="Calibri" w:hAnsi="Calibri"/>
-          <w:color w:val="1D2530"/>
-          <w:sz w:val="20"/>
-        </w:rPr>
-        <w:t>Optimised 5 acquisition journeys (on-page SEO, CTAs, site structure) via GA4 — bounce rate cut by 18%</w:t>
-      </w:r>
-    </w:p>
-    <w:p>
-      <w:pPr>
-        <w:pStyle w:val="ListBullet"/>
-        <w:spacing w:after="60"/>
-      </w:pPr>
-      <w:r>
-        <w:rPr>
-          <w:rFonts w:ascii="Calibri" w:hAnsi="Calibri"/>
-          <w:color w:val="1D2530"/>
-          <w:sz w:val="20"/>
-        </w:rPr>
-        <w:t>Ran a competitive analysis of 5 players — 7 recommendations adopted into the Q1 2024 marketing plan by management</w:t>
-      </w:r>
-    </w:p>
-    <w:p>
-      <w:pPr>
-        <w:spacing w:after="160"/>
-      </w:pPr>
-      <w:r>
-        <w:rPr>
-          <w:rFonts w:ascii="Calibri" w:hAnsi="Calibri"/>
-          <w:b w:val="0"/>
-          <w:i/>
-          <w:color w:val="5B6472"/>
-          <w:sz w:val="18"/>
-        </w:rPr>
-        <w:t>Stack: Webmecanik, Google Analytics 4, WordPress, Canva, Mailchimp</w:t>
-      </w:r>
-    </w:p>
-    <w:tbl>
-      <w:tblPr>
-        <w:tblW w:type="auto" w:w="0"/>
-        <w:jc w:val="left"/>
-        <w:tblLayout w:type="autofit"/>
-        <w:tblLook w:firstColumn="1" w:firstRow="1" w:lastColumn="0" w:lastRow="0" w:noHBand="0" w:noVBand="1" w:val="04A0"/>
-      </w:tblPr>
-      <w:tblGrid>
-        <w:gridCol w:w="5213"/>
-        <w:gridCol w:w="5213"/>
-      </w:tblGrid>
-      <w:tr>
-        <w:tc>
-          <w:tcPr>
-            <w:tcW w:type="dxa" w:w="5213"/>
-          </w:tcPr>
-          <w:p>
-            <w:r>
-              <w:rPr>
-                <w:rFonts w:ascii="Calibri" w:hAnsi="Calibri"/>
-                <w:b/>
-                <w:color w:val="12283F"/>
-                <w:sz w:val="22"/>
-              </w:rPr>
-              <w:t>Product Manager Assistant  |  American Cola (Source du Pays) | Douala, Cameroon</w:t>
-            </w:r>
-          </w:p>
-        </w:tc>
-        <w:tc>
-          <w:tcPr>
-            <w:tcW w:type="dxa" w:w="5213"/>
-          </w:tcPr>
-          <w:p>
-            <w:pPr>
-              <w:jc w:val="right"/>
-            </w:pPr>
-            <w:r>
-              <w:rPr>
-                <w:rFonts w:ascii="Calibri" w:hAnsi="Calibri"/>
-                <w:b/>
-                <w:color w:val="A9793F"/>
-                <w:sz w:val="19"/>
-              </w:rPr>
-              <w:t>03/2022 – 08/2022</w:t>
-            </w:r>
-          </w:p>
-        </w:tc>
-      </w:tr>
-    </w:tbl>
-    <w:p>
-      <w:pPr>
-        <w:pStyle w:val="ListBullet"/>
-        <w:spacing w:after="60"/>
-      </w:pPr>
-      <w:r>
-        <w:rPr>
-          <w:rFonts w:ascii="Calibri" w:hAnsi="Calibri"/>
-          <w:color w:val="1D2530"/>
-          <w:sz w:val="20"/>
-        </w:rPr>
-        <w:t>Conducted a market study of 120 consumers and monitored 6 competitors — delivered the brief to management for the product launch</w:t>
-      </w:r>
-    </w:p>
-    <w:p>
-      <w:pPr>
-        <w:pStyle w:val="ListBullet"/>
-        <w:spacing w:after="60"/>
-      </w:pPr>
-      <w:r>
-        <w:rPr>
-          <w:rFonts w:ascii="Calibri" w:hAnsi="Calibri"/>
-          <w:color w:val="1D2530"/>
-          <w:sz w:val="20"/>
-        </w:rPr>
-        <w:t>Analysed post-launch performance data (sales, market share, field feedback) — produced a formal monthly report</w:t>
-      </w:r>
-    </w:p>
-    <w:p>
-      <w:pPr>
-        <w:spacing w:before="200" w:after="80"/>
+        <w:spacing w:before="140" w:after="60"/>
+        <w:pBdr>
+          <w:bottom w:val="single" w:sz="5" w:space="2" w:color="12283F"/>
+        </w:pBdr>
       </w:pPr>
       <w:r>
         <w:rPr>
           <w:rFonts w:ascii="Calibri" w:hAnsi="Calibri"/>
           <w:b/>
           <w:color w:val="A9793F"/>
-          <w:sz w:val="23"/>
+          <w:sz w:val="21"/>
         </w:rPr>
-        <w:t>MARKETING &amp; DATA PROJECTS 2026</w:t>
+        <w:t>PROJECTS</w:t>
       </w:r>
     </w:p>
     <w:p>
       <w:pPr>
-        <w:spacing w:before="40" w:after="120"/>
-        <w:pBdr>
-          <w:bottom w:val="single" w:sz="6" w:space="1" w:color="12283F"/>
-        </w:pBdr>
-      </w:pPr>
-    </w:p>
-    <w:p>
-      <w:pPr>
-        <w:pStyle w:val="ListBullet"/>
-        <w:spacing w:after="60"/>
+        <w:spacing w:after="60" w:before="0"/>
+        <w:jc w:val="left"/>
       </w:pPr>
       <w:r>
         <w:rPr>
           <w:rFonts w:ascii="Calibri" w:hAnsi="Calibri"/>
+          <w:b w:val="0"/>
           <w:color w:val="1D2530"/>
-          <w:sz w:val="20"/>
+          <w:sz w:val="18"/>
         </w:rPr>
-        <w:t>Power BI acquisition tracking dashboard: 12 key indicators (leads, channels, conversion rate, ROI) on simulated CRM data</w:t>
+        <w:t>BNP Paribas UX audit · Mustela &amp; Club Med SEO audit (56 pp.) · Power BI dashboard · Lemonway AI adoption plan</w:t>
       </w:r>
     </w:p>
     <w:p>
       <w:pPr>
-        <w:pStyle w:val="ListBullet"/>
-        <w:spacing w:after="60"/>
-      </w:pPr>
-      <w:r>
-        <w:rPr>
-          <w:rFonts w:ascii="Calibri" w:hAnsi="Calibri"/>
-          <w:color w:val="1D2530"/>
-          <w:sz w:val="20"/>
-        </w:rPr>
-        <w:t>Marketing KPI processing and analysis in Python/pandas (CSV cleaning, open/click/conversion rate calculations) — automated report output</w:t>
-      </w:r>
-    </w:p>
-    <w:p>
-      <w:pPr>
-        <w:pStyle w:val="ListBullet"/>
-        <w:spacing w:after="60"/>
-      </w:pPr>
-      <w:r>
-        <w:rPr>
-          <w:rFonts w:ascii="Calibri" w:hAnsi="Calibri"/>
-          <w:color w:val="1D2530"/>
-          <w:sz w:val="20"/>
-        </w:rPr>
-        <w:t>Full SEO audit (technical, semantic, netlinking) for MUSTELA and Club Med</w:t>
-      </w:r>
-    </w:p>
-    <w:p>
-      <w:pPr>
-        <w:spacing w:before="200" w:after="80"/>
+        <w:spacing w:before="140" w:after="60"/>
+        <w:pBdr>
+          <w:bottom w:val="single" w:sz="5" w:space="2" w:color="12283F"/>
+        </w:pBdr>
       </w:pPr>
       <w:r>
         <w:rPr>
           <w:rFonts w:ascii="Calibri" w:hAnsi="Calibri"/>
           <w:b/>
           <w:color w:val="A9793F"/>
-          <w:sz w:val="23"/>
+          <w:sz w:val="21"/>
         </w:rPr>
         <w:t>EDUCATION</w:t>
       </w:r>
     </w:p>
     <w:p>
       <w:pPr>
-        <w:spacing w:before="40" w:after="120"/>
-        <w:pBdr>
-          <w:bottom w:val="single" w:sz="6" w:space="1" w:color="12283F"/>
-        </w:pBdr>
-      </w:pPr>
-    </w:p>
-    <w:p>
-      <w:pPr>
-        <w:spacing w:after="20"/>
-      </w:pPr>
-      <w:r>
-        <w:rPr>
-          <w:rFonts w:ascii="Calibri" w:hAnsi="Calibri"/>
-          <w:b/>
-          <w:i w:val="0"/>
-          <w:color w:val="1D2530"/>
-          <w:sz w:val="20"/>
-        </w:rPr>
-        <w:t>Master's — Customer Journey Digitalisation: EM Strasbourg Business School, 2024–2025</w:t>
-      </w:r>
-    </w:p>
-    <w:p>
-      <w:pPr>
-        <w:spacing w:after="120"/>
+        <w:spacing w:after="30" w:before="0"/>
+        <w:jc w:val="left"/>
       </w:pPr>
       <w:r>
         <w:rPr>
           <w:rFonts w:ascii="Calibri" w:hAnsi="Calibri"/>
           <w:b w:val="0"/>
-          <w:i w:val="0"/>
-          <w:color w:val="5B6472"/>
+          <w:color w:val="1D2530"/>
           <w:sz w:val="18"/>
         </w:rPr>
-        <w:t>Data Marketing · Marketing Automation · SEO/SEA · Customer Acquisition · CRM · Web Analytics · Omnichannel Journeys</w:t>
+        <w:t>Master's in Customer Journey Digitalisation — EM Strasbourg Business School (2024–2025)</w:t>
       </w:r>
     </w:p>
     <w:p>
       <w:pPr>
-        <w:spacing w:after="20"/>
-      </w:pPr>
-      <w:r>
-        <w:rPr>
-          <w:rFonts w:ascii="Calibri" w:hAnsi="Calibri"/>
-          <w:b/>
-          <w:i w:val="0"/>
-          <w:color w:val="1D2530"/>
-          <w:sz w:val="20"/>
-        </w:rPr>
-        <w:t>Master's — Marketing &amp; Customer Relations: EM Strasbourg Business School, 2022–2023</w:t>
-      </w:r>
-    </w:p>
-    <w:p>
-      <w:pPr>
-        <w:spacing w:after="120"/>
+        <w:spacing w:after="60" w:before="0"/>
+        <w:jc w:val="left"/>
       </w:pPr>
       <w:r>
         <w:rPr>
           <w:rFonts w:ascii="Calibri" w:hAnsi="Calibri"/>
           <w:b w:val="0"/>
-          <w:i w:val="0"/>
-          <w:color w:val="5B6472"/>
+          <w:color w:val="1D2530"/>
           <w:sz w:val="18"/>
         </w:rPr>
-        <w:t>Growth Hacking · Customer Acquisition · Digital Transformation · Web Technologies · Consumer Behaviour</w:t>
+        <w:t>Master's in Marketing &amp; Customer Relations — EM Strasbourg Business School (2022–2023)</w:t>
       </w:r>
     </w:p>
     <w:p>
       <w:pPr>
-        <w:spacing w:before="200" w:after="80"/>
+        <w:spacing w:before="140" w:after="60"/>
+        <w:pBdr>
+          <w:bottom w:val="single" w:sz="5" w:space="2" w:color="12283F"/>
+        </w:pBdr>
       </w:pPr>
       <w:r>
         <w:rPr>
           <w:rFonts w:ascii="Calibri" w:hAnsi="Calibri"/>
           <w:b/>
           <w:color w:val="A9793F"/>
-          <w:sz w:val="23"/>
+          <w:sz w:val="21"/>
         </w:rPr>
         <w:t>LANGUAGES &amp; QUALITIES</w:t>
       </w:r>
     </w:p>
     <w:p>
       <w:pPr>
-        <w:spacing w:before="40" w:after="120"/>
-        <w:pBdr>
-          <w:bottom w:val="single" w:sz="6" w:space="1" w:color="12283F"/>
-        </w:pBdr>
-      </w:pPr>
-    </w:p>
-    <w:p>
-      <w:pPr>
-        <w:spacing w:after="40"/>
+        <w:spacing w:after="0" w:before="0"/>
+        <w:jc w:val="left"/>
       </w:pPr>
       <w:r>
         <w:rPr>
           <w:rFonts w:ascii="Calibri" w:hAnsi="Calibri"/>
           <w:b w:val="0"/>
-          <w:i w:val="0"/>
           <w:color w:val="1D2530"/>
-          <w:sz w:val="20"/>
+          <w:sz w:val="18"/>
         </w:rPr>
-        <w:t>Languages: French (native, C2), English (C2), Spanish (A2)</w:t>
-      </w:r>
-    </w:p>
-    <w:p>
-      <w:pPr>
-        <w:spacing w:after="40"/>
-      </w:pPr>
-      <w:r>
-        <w:rPr>
-          <w:rFonts w:ascii="Calibri" w:hAnsi="Calibri"/>
-          <w:b w:val="0"/>
-          <w:i w:val="0"/>
-          <w:color w:val="1D2530"/>
-          <w:sz w:val="20"/>
-        </w:rPr>
-        <w:t>Qualities: Organisation, rigor, autonomy, communication, team spirit, curiosity, proactivity</w:t>
+        <w:t>French C2 · English C2 · Spanish A2 — Organisation, rigour, autonomy, communication, team spirit, curiosity</w:t>
       </w:r>
     </w:p>
     <w:sectPr>
       <w:pgSz w:w="12240" w:h="15840"/>
-      <w:pgMar w:top="737" w:right="907" w:bottom="737" w:left="907" w:header="720" w:footer="720" w:gutter="0"/>
+      <w:pgMar w:top="680" w:right="907" w:bottom="567" w:left="907" w:header="720" w:footer="720" w:gutter="0"/>
       <w:cols w:space="720"/>
       <w:docGrid w:linePitch="360"/>
     </w:sectPr>
@@ -1119,7 +803,7 @@
     <w:rsid w:val="00FC693F"/>
     <w:rPr>
       <w:rFonts w:ascii="Calibri" w:hAnsi="Calibri"/>
-      <w:sz w:val="20"/>
+      <w:sz w:val="19"/>
     </w:rPr>
   </w:style>
   <w:style w:type="paragraph" w:styleId="Header">

</xml_diff>